<commit_message>
fix(import-export): point sample-download links at GitHub raw URL
Mintlify serves pages and images but not .xlsx files (they 404), so the
"/files/import-export/*.xlsx" download cards were broken on the deployed site.
Repoint all 9 download cards to the file's GitHub raw URL on main
(https://raw.githubusercontent.com/onvoxdash/docs/main/files/import-export/...),
which serves the .xlsx as application/octet-stream. Files remain in
files/import-export/. Authoring guide updated to explain this.

Co-Authored-By: Claude Opus 4.8 (1M context) <noreply@anthropic.com>
</commit_message>
<xml_diff>
--- a/_authoring/Import-Export-Wiki-Authoring-Guide.docx
+++ b/_authoring/Import-Export-Wiki-Authoring-Guide.docx
@@ -643,13 +643,147 @@
         <w:pStyle w:val="FirstParagraph"/>
       </w:pPr>
       <w:r>
-        <w:t xml:space="preserve">Each page already links to its sample with a download card, so the links work as soon</w:t>
-      </w:r>
-      <w:r>
-        <w:t xml:space="preserve"> </w:t>
-      </w:r>
-      <w:r>
-        <w:t xml:space="preserve">as the pages go live.</w:t>
+        <w:t xml:space="preserve">Each page links to its sample with a download card.</w:t>
+      </w:r>
+    </w:p>
+    <w:p>
+      <w:pPr>
+        <w:pStyle w:val="BlockText"/>
+      </w:pPr>
+      <w:r>
+        <w:rPr>
+          <w:b/>
+          <w:bCs/>
+        </w:rPr>
+        <w:t xml:space="preserve">Important — why the download links use a GitHub URL.</w:t>
+      </w:r>
+      <w:r>
+        <w:t xml:space="preserve"> </w:t>
+      </w:r>
+      <w:r>
+        <w:t xml:space="preserve">Mintlify serves pages and</w:t>
+      </w:r>
+      <w:r>
+        <w:t xml:space="preserve"> </w:t>
+      </w:r>
+      <w:r>
+        <w:t xml:space="preserve">images, but it does</w:t>
+      </w:r>
+      <w:r>
+        <w:t xml:space="preserve"> </w:t>
+      </w:r>
+      <w:r>
+        <w:rPr>
+          <w:b/>
+          <w:bCs/>
+        </w:rPr>
+        <w:t xml:space="preserve">not</w:t>
+      </w:r>
+      <w:r>
+        <w:t xml:space="preserve"> </w:t>
+      </w:r>
+      <w:r>
+        <w:t xml:space="preserve">serve</w:t>
+      </w:r>
+      <w:r>
+        <w:t xml:space="preserve"> </w:t>
+      </w:r>
+      <w:r>
+        <w:rPr>
+          <w:rStyle w:val="VerbatimChar"/>
+        </w:rPr>
+        <w:t xml:space="preserve">.xlsx</w:t>
+      </w:r>
+      <w:r>
+        <w:t xml:space="preserve"> </w:t>
+      </w:r>
+      <w:r>
+        <w:t xml:space="preserve">files as static downloads (they return</w:t>
+      </w:r>
+      <w:r>
+        <w:t xml:space="preserve"> </w:t>
+      </w:r>
+      <w:r>
+        <w:t xml:space="preserve">404). So each download card points to the file’s GitHub</w:t>
+      </w:r>
+      <w:r>
+        <w:t xml:space="preserve"> </w:t>
+      </w:r>
+      <w:r>
+        <w:rPr>
+          <w:i/>
+          <w:iCs/>
+        </w:rPr>
+        <w:t xml:space="preserve">raw</w:t>
+      </w:r>
+      <w:r>
+        <w:t xml:space="preserve"> </w:t>
+      </w:r>
+      <w:r>
+        <w:t xml:space="preserve">URL in this repo:</w:t>
+      </w:r>
+      <w:r>
+        <w:t xml:space="preserve"> </w:t>
+      </w:r>
+      <w:r>
+        <w:rPr>
+          <w:rStyle w:val="VerbatimChar"/>
+        </w:rPr>
+        <w:t xml:space="preserve">https://raw.githubusercontent.com/onvoxdash/docs/main/files/import-export/&lt;file&gt;.xlsx</w:t>
+      </w:r>
+      <w:r>
+        <w:t xml:space="preserve">.</w:t>
+      </w:r>
+      <w:r>
+        <w:t xml:space="preserve"> </w:t>
+      </w:r>
+      <w:r>
+        <w:t xml:space="preserve">The</w:t>
+      </w:r>
+      <w:r>
+        <w:t xml:space="preserve"> </w:t>
+      </w:r>
+      <w:r>
+        <w:rPr>
+          <w:rStyle w:val="VerbatimChar"/>
+        </w:rPr>
+        <w:t xml:space="preserve">.xlsx</w:t>
+      </w:r>
+      <w:r>
+        <w:t xml:space="preserve"> </w:t>
+      </w:r>
+      <w:r>
+        <w:t xml:space="preserve">files still live in</w:t>
+      </w:r>
+      <w:r>
+        <w:t xml:space="preserve"> </w:t>
+      </w:r>
+      <w:r>
+        <w:rPr>
+          <w:rStyle w:val="VerbatimChar"/>
+        </w:rPr>
+        <w:t xml:space="preserve">files/import-export/</w:t>
+      </w:r>
+      <w:r>
+        <w:t xml:space="preserve"> </w:t>
+      </w:r>
+      <w:r>
+        <w:t xml:space="preserve">— keep them there (on the</w:t>
+      </w:r>
+      <w:r>
+        <w:t xml:space="preserve"> </w:t>
+      </w:r>
+      <w:r>
+        <w:rPr>
+          <w:rStyle w:val="VerbatimChar"/>
+        </w:rPr>
+        <w:t xml:space="preserve">main</w:t>
+      </w:r>
+      <w:r>
+        <w:t xml:space="preserve"> </w:t>
+      </w:r>
+      <w:r>
+        <w:t xml:space="preserve">branch) so the raw links resolve.</w:t>
       </w:r>
     </w:p>
     <w:p>
@@ -1724,13 +1858,43 @@
         <w:t xml:space="preserve">files/import-export/</w:t>
       </w:r>
       <w:r>
-        <w:t xml:space="preserve">. The file names stay</w:t>
-      </w:r>
-      <w:r>
-        <w:t xml:space="preserve"> </w:t>
-      </w:r>
-      <w:r>
-        <w:t xml:space="preserve">the same, so the page links don’t change.</w:t>
+        <w:t xml:space="preserve">, then commit and push</w:t>
+      </w:r>
+      <w:r>
+        <w:t xml:space="preserve"> </w:t>
+      </w:r>
+      <w:r>
+        <w:t xml:space="preserve">to</w:t>
+      </w:r>
+      <w:r>
+        <w:t xml:space="preserve"> </w:t>
+      </w:r>
+      <w:r>
+        <w:rPr>
+          <w:rStyle w:val="VerbatimChar"/>
+        </w:rPr>
+        <w:t xml:space="preserve">main</w:t>
+      </w:r>
+      <w:r>
+        <w:t xml:space="preserve">. The file names stay the same and the download links point at the GitHub raw</w:t>
+      </w:r>
+      <w:r>
+        <w:t xml:space="preserve"> </w:t>
+      </w:r>
+      <w:r>
+        <w:t xml:space="preserve">URL on</w:t>
+      </w:r>
+      <w:r>
+        <w:t xml:space="preserve"> </w:t>
+      </w:r>
+      <w:r>
+        <w:rPr>
+          <w:rStyle w:val="VerbatimChar"/>
+        </w:rPr>
+        <w:t xml:space="preserve">main</w:t>
+      </w:r>
+      <w:r>
+        <w:t xml:space="preserve">, so replacing the file is all that’s needed — no page edit.</w:t>
       </w:r>
     </w:p>
     <w:p>

</xml_diff>